<commit_message>
dynamic input fields in doc5
</commit_message>
<xml_diff>
--- a/public/docs/Notice of Post-Qualification.docx
+++ b/public/docs/Notice of Post-Qualification.docx
@@ -21,8 +21,8 @@
           <w:szCs w:val="36"/>
         </w:rPr>
       </w:r>
-      <w:bookmarkStart w:id="0" w:name="_Hlk518554016"/>
-      <w:bookmarkStart w:id="1" w:name="_Hlk521423172"/>
+      <w:bookmarkStart w:id="0" w:name="_Hlk521423172"/>
+      <w:bookmarkStart w:id="1" w:name="_Hlk518554016"/>
     </w:p>
     <w:p>
       <w:pPr>
@@ -184,7 +184,7 @@
             </v:handles>
             <o:lock v:ext="edit" text="t" shapetype="t"/>
           </v:shapetype>
-          <v:shape id="shape_0" adj="10800" fillcolor="black" stroked="t" o:allowincell="f" style="position:absolute;margin-left:-27.5pt;margin-top:19.85pt;width:495.3pt;height:17.05pt;mso-wrap-style:none;v-text-anchor:middle" type="_x0000_t136">
+          <v:shape id="shape_0" adj="10800" fillcolor="black" stroked="t" o:allowincell="f" style="position:absolute;margin-left:-27.5pt;margin-top:19.85pt;width:495.25pt;height:17pt;mso-wrap-style:none;v-text-anchor:middle" type="_x0000_t136">
             <v:path textpathok="t"/>
             <v:textpath on="t" fitshape="t" string="Bids and Awards Committee (BAC) Office" style="font-family:&quot;Impact&quot;;font-size:11pt" trim="t"/>
             <v:fill o:detectmouseclick="t" type="solid" color2="white"/>
@@ -556,9 +556,9 @@
         </w:rPr>
         <w:t>the</w:t>
       </w:r>
-      <w:bookmarkStart w:id="7" w:name="_Hlk141795745"/>
+      <w:bookmarkStart w:id="7" w:name="bmProjectName"/>
       <w:bookmarkStart w:id="8" w:name="_Hlk204711949"/>
-      <w:bookmarkStart w:id="9" w:name="bmProjectName"/>
+      <w:bookmarkStart w:id="9" w:name="_Hlk141795745"/>
       <w:r>
         <w:rPr>
           <w:rFonts w:cs="Times New Roman" w:ascii="Times New Roman" w:hAnsi="Times New Roman"/>
@@ -900,7 +900,25 @@
           <w:szCs w:val="24"/>
           <w:u w:val="single"/>
         </w:rPr>
-        <w:t xml:space="preserve">           {{date}}            </w:t>
+        <w:t xml:space="preserve">           </w:t>
+      </w:r>
+      <w:r>
+        <w:rPr>
+          <w:rFonts w:cs="Times New Roman" w:ascii="Times New Roman" w:hAnsi="Times New Roman"/>
+          <w:sz w:val="24"/>
+          <w:szCs w:val="24"/>
+          <w:u w:val="single"/>
+        </w:rPr>
+        <w:t>{{notice_date}}</w:t>
+      </w:r>
+      <w:r>
+        <w:rPr>
+          <w:rFonts w:cs="Times New Roman" w:ascii="Times New Roman" w:hAnsi="Times New Roman"/>
+          <w:sz w:val="24"/>
+          <w:szCs w:val="24"/>
+          <w:u w:val="single"/>
+        </w:rPr>
+        <w:t xml:space="preserve">            </w:t>
       </w:r>
     </w:p>
     <w:sectPr>
@@ -1502,8 +1520,8 @@
       <w:lang w:val="en-GB" w:eastAsia="en-GB"/>
     </w:rPr>
   </w:style>
-  <w:style w:type="paragraph" w:styleId="FrameContents">
-    <w:name w:val="Frame Contents"/>
+  <w:style w:type="paragraph" w:styleId="FrameContentsuser">
+    <w:name w:val="Frame Contents (user)"/>
     <w:basedOn w:val="Normal"/>
     <w:qFormat/>
     <w:pPr/>

</xml_diff>